<commit_message>
Enhance multi-agent system with per-agent model configuration and improved audit logging
- Updated health check endpoint to return active per-agent model mappings.
- Modified agent classes (Compliance, Intake, Orchestrator, Planner, Risk) to include agent-specific model names in audit events.
- Introduced per-agent model configuration in the .env file for better flexibility.
- Enhanced the settings class to manage agent-specific models and provide a mapping function.
- Updated LLM service to build models based on agent-specific configurations.
- Improved documentation to reflect changes in architecture and model assignments.
- Added tests to ensure distinct agent models are assigned in the example environment configuration.
</commit_message>
<xml_diff>
--- a/docs/CTSE_Assignment2_Report.docx
+++ b/docs/CTSE_Assignment2_Report.docx
@@ -76,16 +76,16 @@
         <w:tblLook w:firstColumn="1" w:firstRow="1" w:lastColumn="0" w:lastRow="0" w:noHBand="0" w:noVBand="1" w:val="04A0"/>
       </w:tblPr>
       <w:tblGrid>
-        <w:gridCol w:w="1987"/>
-        <w:gridCol w:w="1987"/>
-        <w:gridCol w:w="1987"/>
-        <w:gridCol w:w="1987"/>
-        <w:gridCol w:w="1987"/>
+        <w:gridCol w:w="2033"/>
+        <w:gridCol w:w="2033"/>
+        <w:gridCol w:w="2033"/>
+        <w:gridCol w:w="2033"/>
+        <w:gridCol w:w="2033"/>
       </w:tblGrid>
       <w:tr>
         <w:tc>
           <w:tcPr>
-            <w:tcW w:type="dxa" w:w="1987"/>
+            <w:tcW w:type="dxa" w:w="2033"/>
             <w:shd w:fill="DCEBF7"/>
             <w:tcMar>
               <w:top w:w="80" w:type="dxa"/>
@@ -109,7 +109,7 @@
         </w:tc>
         <w:tc>
           <w:tcPr>
-            <w:tcW w:type="dxa" w:w="1987"/>
+            <w:tcW w:type="dxa" w:w="2033"/>
             <w:shd w:fill="E8F4EA"/>
             <w:tcMar>
               <w:top w:w="80" w:type="dxa"/>
@@ -133,7 +133,7 @@
         </w:tc>
         <w:tc>
           <w:tcPr>
-            <w:tcW w:type="dxa" w:w="1987"/>
+            <w:tcW w:type="dxa" w:w="2033"/>
             <w:shd w:fill="FFF1D6"/>
             <w:tcMar>
               <w:top w:w="80" w:type="dxa"/>
@@ -157,7 +157,7 @@
         </w:tc>
         <w:tc>
           <w:tcPr>
-            <w:tcW w:type="dxa" w:w="1987"/>
+            <w:tcW w:type="dxa" w:w="2033"/>
             <w:shd w:fill="FCE4EC"/>
             <w:tcMar>
               <w:top w:w="80" w:type="dxa"/>
@@ -181,7 +181,7 @@
         </w:tc>
         <w:tc>
           <w:tcPr>
-            <w:tcW w:type="dxa" w:w="1987"/>
+            <w:tcW w:type="dxa" w:w="2033"/>
             <w:shd w:fill="EDE7F6"/>
             <w:tcMar>
               <w:top w:w="80" w:type="dxa"/>
@@ -210,7 +210,7 @@
         <w:pStyle w:val="IntenseQuote"/>
       </w:pPr>
       <w:r>
-        <w:t>Each agent uses at least one custom Python tool, while LangGraph passes shared state and checkpoints between nodes.</w:t>
+        <w:t>Each agent uses at least one custom Python tool and a configurable local SLM, while LangGraph passes shared state and checkpoints between nodes.</w:t>
       </w:r>
     </w:p>
     <w:p>
@@ -229,15 +229,15 @@
         <w:tblLook w:firstColumn="1" w:firstRow="1" w:lastColumn="0" w:lastRow="0" w:noHBand="0" w:noVBand="1" w:val="04A0"/>
       </w:tblPr>
       <w:tblGrid>
-        <w:gridCol w:w="2484"/>
-        <w:gridCol w:w="2484"/>
-        <w:gridCol w:w="2484"/>
-        <w:gridCol w:w="2484"/>
+        <w:gridCol w:w="2541"/>
+        <w:gridCol w:w="2541"/>
+        <w:gridCol w:w="2541"/>
+        <w:gridCol w:w="2541"/>
       </w:tblGrid>
       <w:tr>
         <w:tc>
           <w:tcPr>
-            <w:tcW w:type="dxa" w:w="2484"/>
+            <w:tcW w:type="dxa" w:w="2541"/>
             <w:shd w:fill="D9EAF7"/>
           </w:tcPr>
           <w:p>
@@ -248,7 +248,7 @@
         </w:tc>
         <w:tc>
           <w:tcPr>
-            <w:tcW w:type="dxa" w:w="2484"/>
+            <w:tcW w:type="dxa" w:w="2541"/>
             <w:shd w:fill="D9EAF7"/>
           </w:tcPr>
           <w:p>
@@ -259,7 +259,7 @@
         </w:tc>
         <w:tc>
           <w:tcPr>
-            <w:tcW w:type="dxa" w:w="2484"/>
+            <w:tcW w:type="dxa" w:w="2541"/>
             <w:shd w:fill="D9EAF7"/>
           </w:tcPr>
           <w:p>
@@ -270,7 +270,7 @@
         </w:tc>
         <w:tc>
           <w:tcPr>
-            <w:tcW w:type="dxa" w:w="2484"/>
+            <w:tcW w:type="dxa" w:w="2541"/>
             <w:shd w:fill="D9EAF7"/>
           </w:tcPr>
           <w:p>
@@ -283,7 +283,7 @@
       <w:tr>
         <w:tc>
           <w:tcPr>
-            <w:tcW w:type="dxa" w:w="2484"/>
+            <w:tcW w:type="dxa" w:w="2541"/>
             <w:tcMar>
               <w:top w:w="80" w:type="dxa"/>
               <w:start w:w="120" w:type="dxa"/>
@@ -299,7 +299,7 @@
         </w:tc>
         <w:tc>
           <w:tcPr>
-            <w:tcW w:type="dxa" w:w="2484"/>
+            <w:tcW w:type="dxa" w:w="2541"/>
             <w:tcMar>
               <w:top w:w="80" w:type="dxa"/>
               <w:start w:w="120" w:type="dxa"/>
@@ -315,7 +315,7 @@
         </w:tc>
         <w:tc>
           <w:tcPr>
-            <w:tcW w:type="dxa" w:w="2484"/>
+            <w:tcW w:type="dxa" w:w="2541"/>
             <w:tcMar>
               <w:top w:w="80" w:type="dxa"/>
               <w:start w:w="120" w:type="dxa"/>
@@ -331,7 +331,7 @@
         </w:tc>
         <w:tc>
           <w:tcPr>
-            <w:tcW w:type="dxa" w:w="2484"/>
+            <w:tcW w:type="dxa" w:w="2541"/>
             <w:tcMar>
               <w:top w:w="80" w:type="dxa"/>
               <w:start w:w="120" w:type="dxa"/>
@@ -349,7 +349,7 @@
       <w:tr>
         <w:tc>
           <w:tcPr>
-            <w:tcW w:type="dxa" w:w="2484"/>
+            <w:tcW w:type="dxa" w:w="2541"/>
             <w:tcMar>
               <w:top w:w="80" w:type="dxa"/>
               <w:start w:w="120" w:type="dxa"/>
@@ -365,7 +365,7 @@
         </w:tc>
         <w:tc>
           <w:tcPr>
-            <w:tcW w:type="dxa" w:w="2484"/>
+            <w:tcW w:type="dxa" w:w="2541"/>
             <w:tcMar>
               <w:top w:w="80" w:type="dxa"/>
               <w:start w:w="120" w:type="dxa"/>
@@ -381,7 +381,7 @@
         </w:tc>
         <w:tc>
           <w:tcPr>
-            <w:tcW w:type="dxa" w:w="2484"/>
+            <w:tcW w:type="dxa" w:w="2541"/>
             <w:tcMar>
               <w:top w:w="80" w:type="dxa"/>
               <w:start w:w="120" w:type="dxa"/>
@@ -397,7 +397,7 @@
         </w:tc>
         <w:tc>
           <w:tcPr>
-            <w:tcW w:type="dxa" w:w="2484"/>
+            <w:tcW w:type="dxa" w:w="2541"/>
             <w:tcMar>
               <w:top w:w="80" w:type="dxa"/>
               <w:start w:w="120" w:type="dxa"/>
@@ -415,7 +415,7 @@
       <w:tr>
         <w:tc>
           <w:tcPr>
-            <w:tcW w:type="dxa" w:w="2484"/>
+            <w:tcW w:type="dxa" w:w="2541"/>
             <w:tcMar>
               <w:top w:w="80" w:type="dxa"/>
               <w:start w:w="120" w:type="dxa"/>
@@ -431,7 +431,7 @@
         </w:tc>
         <w:tc>
           <w:tcPr>
-            <w:tcW w:type="dxa" w:w="2484"/>
+            <w:tcW w:type="dxa" w:w="2541"/>
             <w:tcMar>
               <w:top w:w="80" w:type="dxa"/>
               <w:start w:w="120" w:type="dxa"/>
@@ -447,7 +447,7 @@
         </w:tc>
         <w:tc>
           <w:tcPr>
-            <w:tcW w:type="dxa" w:w="2484"/>
+            <w:tcW w:type="dxa" w:w="2541"/>
             <w:tcMar>
               <w:top w:w="80" w:type="dxa"/>
               <w:start w:w="120" w:type="dxa"/>
@@ -463,7 +463,7 @@
         </w:tc>
         <w:tc>
           <w:tcPr>
-            <w:tcW w:type="dxa" w:w="2484"/>
+            <w:tcW w:type="dxa" w:w="2541"/>
             <w:tcMar>
               <w:top w:w="80" w:type="dxa"/>
               <w:start w:w="120" w:type="dxa"/>
@@ -481,7 +481,7 @@
       <w:tr>
         <w:tc>
           <w:tcPr>
-            <w:tcW w:type="dxa" w:w="2484"/>
+            <w:tcW w:type="dxa" w:w="2541"/>
             <w:tcMar>
               <w:top w:w="80" w:type="dxa"/>
               <w:start w:w="120" w:type="dxa"/>
@@ -497,7 +497,7 @@
         </w:tc>
         <w:tc>
           <w:tcPr>
-            <w:tcW w:type="dxa" w:w="2484"/>
+            <w:tcW w:type="dxa" w:w="2541"/>
             <w:tcMar>
               <w:top w:w="80" w:type="dxa"/>
               <w:start w:w="120" w:type="dxa"/>
@@ -513,7 +513,7 @@
         </w:tc>
         <w:tc>
           <w:tcPr>
-            <w:tcW w:type="dxa" w:w="2484"/>
+            <w:tcW w:type="dxa" w:w="2541"/>
             <w:tcMar>
               <w:top w:w="80" w:type="dxa"/>
               <w:start w:w="120" w:type="dxa"/>
@@ -529,7 +529,7 @@
         </w:tc>
         <w:tc>
           <w:tcPr>
-            <w:tcW w:type="dxa" w:w="2484"/>
+            <w:tcW w:type="dxa" w:w="2541"/>
             <w:tcMar>
               <w:top w:w="80" w:type="dxa"/>
               <w:start w:w="120" w:type="dxa"/>
@@ -547,7 +547,7 @@
       <w:tr>
         <w:tc>
           <w:tcPr>
-            <w:tcW w:type="dxa" w:w="2484"/>
+            <w:tcW w:type="dxa" w:w="2541"/>
             <w:tcMar>
               <w:top w:w="80" w:type="dxa"/>
               <w:start w:w="120" w:type="dxa"/>
@@ -563,7 +563,7 @@
         </w:tc>
         <w:tc>
           <w:tcPr>
-            <w:tcW w:type="dxa" w:w="2484"/>
+            <w:tcW w:type="dxa" w:w="2541"/>
             <w:tcMar>
               <w:top w:w="80" w:type="dxa"/>
               <w:start w:w="120" w:type="dxa"/>
@@ -579,7 +579,7 @@
         </w:tc>
         <w:tc>
           <w:tcPr>
-            <w:tcW w:type="dxa" w:w="2484"/>
+            <w:tcW w:type="dxa" w:w="2541"/>
             <w:tcMar>
               <w:top w:w="80" w:type="dxa"/>
               <w:start w:w="120" w:type="dxa"/>
@@ -595,7 +595,7 @@
         </w:tc>
         <w:tc>
           <w:tcPr>
-            <w:tcW w:type="dxa" w:w="2484"/>
+            <w:tcW w:type="dxa" w:w="2541"/>
             <w:tcMar>
               <w:top w:w="80" w:type="dxa"/>
               <w:start w:w="120" w:type="dxa"/>
@@ -617,6 +617,320 @@
         <w:pStyle w:val="Heading1"/>
       </w:pPr>
       <w:r>
+        <w:t>Agent-Specific Local Models</w:t>
+      </w:r>
+    </w:p>
+    <w:tbl>
+      <w:tblPr>
+        <w:tblStyle w:val="LightGrid-Accent1"/>
+        <w:tblW w:type="auto" w:w="0"/>
+        <w:jc w:val="center"/>
+        <w:tblLook w:firstColumn="1" w:firstRow="1" w:lastColumn="0" w:lastRow="0" w:noHBand="0" w:noVBand="1" w:val="04A0"/>
+      </w:tblPr>
+      <w:tblGrid>
+        <w:gridCol w:w="3389"/>
+        <w:gridCol w:w="3389"/>
+        <w:gridCol w:w="3389"/>
+      </w:tblGrid>
+      <w:tr>
+        <w:tc>
+          <w:tcPr>
+            <w:tcW w:type="dxa" w:w="3389"/>
+            <w:shd w:fill="E5EEF7"/>
+          </w:tcPr>
+          <w:p>
+            <w:r>
+              <w:t>Agent</w:t>
+            </w:r>
+          </w:p>
+        </w:tc>
+        <w:tc>
+          <w:tcPr>
+            <w:tcW w:type="dxa" w:w="3389"/>
+            <w:shd w:fill="E5EEF7"/>
+          </w:tcPr>
+          <w:p>
+            <w:r>
+              <w:t>Default Ollama model</w:t>
+            </w:r>
+          </w:p>
+        </w:tc>
+        <w:tc>
+          <w:tcPr>
+            <w:tcW w:type="dxa" w:w="3389"/>
+            <w:shd w:fill="E5EEF7"/>
+          </w:tcPr>
+          <w:p>
+            <w:r>
+              <w:t>Reason for assignment</w:t>
+            </w:r>
+          </w:p>
+        </w:tc>
+      </w:tr>
+      <w:tr>
+        <w:tc>
+          <w:tcPr>
+            <w:tcW w:type="dxa" w:w="3389"/>
+            <w:tcMar>
+              <w:top w:w="80" w:type="dxa"/>
+              <w:start w:w="120" w:type="dxa"/>
+              <w:bottom w:w="80" w:type="dxa"/>
+              <w:end w:w="120" w:type="dxa"/>
+            </w:tcMar>
+          </w:tcPr>
+          <w:p>
+            <w:r>
+              <w:t>Orchestrator</w:t>
+            </w:r>
+          </w:p>
+        </w:tc>
+        <w:tc>
+          <w:tcPr>
+            <w:tcW w:type="dxa" w:w="3389"/>
+            <w:tcMar>
+              <w:top w:w="80" w:type="dxa"/>
+              <w:start w:w="120" w:type="dxa"/>
+              <w:bottom w:w="80" w:type="dxa"/>
+              <w:end w:w="120" w:type="dxa"/>
+            </w:tcMar>
+          </w:tcPr>
+          <w:p>
+            <w:r>
+              <w:t>gemma2:2b</w:t>
+            </w:r>
+          </w:p>
+        </w:tc>
+        <w:tc>
+          <w:tcPr>
+            <w:tcW w:type="dxa" w:w="3389"/>
+            <w:tcMar>
+              <w:top w:w="80" w:type="dxa"/>
+              <w:start w:w="120" w:type="dxa"/>
+              <w:bottom w:w="80" w:type="dxa"/>
+              <w:end w:w="120" w:type="dxa"/>
+            </w:tcMar>
+          </w:tcPr>
+          <w:p>
+            <w:r>
+              <w:t>Lightweight routing and objective framing</w:t>
+            </w:r>
+          </w:p>
+        </w:tc>
+      </w:tr>
+      <w:tr>
+        <w:tc>
+          <w:tcPr>
+            <w:tcW w:type="dxa" w:w="3389"/>
+            <w:tcMar>
+              <w:top w:w="80" w:type="dxa"/>
+              <w:start w:w="120" w:type="dxa"/>
+              <w:bottom w:w="80" w:type="dxa"/>
+              <w:end w:w="120" w:type="dxa"/>
+            </w:tcMar>
+          </w:tcPr>
+          <w:p>
+            <w:r>
+              <w:t>Intake</w:t>
+            </w:r>
+          </w:p>
+        </w:tc>
+        <w:tc>
+          <w:tcPr>
+            <w:tcW w:type="dxa" w:w="3389"/>
+            <w:tcMar>
+              <w:top w:w="80" w:type="dxa"/>
+              <w:start w:w="120" w:type="dxa"/>
+              <w:bottom w:w="80" w:type="dxa"/>
+              <w:end w:w="120" w:type="dxa"/>
+            </w:tcMar>
+          </w:tcPr>
+          <w:p>
+            <w:r>
+              <w:t>qwen2.5:7b</w:t>
+            </w:r>
+          </w:p>
+        </w:tc>
+        <w:tc>
+          <w:tcPr>
+            <w:tcW w:type="dxa" w:w="3389"/>
+            <w:tcMar>
+              <w:top w:w="80" w:type="dxa"/>
+              <w:start w:w="120" w:type="dxa"/>
+              <w:bottom w:w="80" w:type="dxa"/>
+              <w:end w:w="120" w:type="dxa"/>
+            </w:tcMar>
+          </w:tcPr>
+          <w:p>
+            <w:r>
+              <w:t>Structured extraction from tender text</w:t>
+            </w:r>
+          </w:p>
+        </w:tc>
+      </w:tr>
+      <w:tr>
+        <w:tc>
+          <w:tcPr>
+            <w:tcW w:type="dxa" w:w="3389"/>
+            <w:tcMar>
+              <w:top w:w="80" w:type="dxa"/>
+              <w:start w:w="120" w:type="dxa"/>
+              <w:bottom w:w="80" w:type="dxa"/>
+              <w:end w:w="120" w:type="dxa"/>
+            </w:tcMar>
+          </w:tcPr>
+          <w:p>
+            <w:r>
+              <w:t>Compliance</w:t>
+            </w:r>
+          </w:p>
+        </w:tc>
+        <w:tc>
+          <w:tcPr>
+            <w:tcW w:type="dxa" w:w="3389"/>
+            <w:tcMar>
+              <w:top w:w="80" w:type="dxa"/>
+              <w:start w:w="120" w:type="dxa"/>
+              <w:bottom w:w="80" w:type="dxa"/>
+              <w:end w:w="120" w:type="dxa"/>
+            </w:tcMar>
+          </w:tcPr>
+          <w:p>
+            <w:r>
+              <w:t>llama3.1:8b</w:t>
+            </w:r>
+          </w:p>
+        </w:tc>
+        <w:tc>
+          <w:tcPr>
+            <w:tcW w:type="dxa" w:w="3389"/>
+            <w:tcMar>
+              <w:top w:w="80" w:type="dxa"/>
+              <w:start w:w="120" w:type="dxa"/>
+              <w:bottom w:w="80" w:type="dxa"/>
+              <w:end w:w="120" w:type="dxa"/>
+            </w:tcMar>
+          </w:tcPr>
+          <w:p>
+            <w:r>
+              <w:t>Evidence comparison and gap analysis</w:t>
+            </w:r>
+          </w:p>
+        </w:tc>
+      </w:tr>
+      <w:tr>
+        <w:tc>
+          <w:tcPr>
+            <w:tcW w:type="dxa" w:w="3389"/>
+            <w:tcMar>
+              <w:top w:w="80" w:type="dxa"/>
+              <w:start w:w="120" w:type="dxa"/>
+              <w:bottom w:w="80" w:type="dxa"/>
+              <w:end w:w="120" w:type="dxa"/>
+            </w:tcMar>
+          </w:tcPr>
+          <w:p>
+            <w:r>
+              <w:t>Risk</w:t>
+            </w:r>
+          </w:p>
+        </w:tc>
+        <w:tc>
+          <w:tcPr>
+            <w:tcW w:type="dxa" w:w="3389"/>
+            <w:tcMar>
+              <w:top w:w="80" w:type="dxa"/>
+              <w:start w:w="120" w:type="dxa"/>
+              <w:bottom w:w="80" w:type="dxa"/>
+              <w:end w:w="120" w:type="dxa"/>
+            </w:tcMar>
+          </w:tcPr>
+          <w:p>
+            <w:r>
+              <w:t>mistral:7b</w:t>
+            </w:r>
+          </w:p>
+        </w:tc>
+        <w:tc>
+          <w:tcPr>
+            <w:tcW w:type="dxa" w:w="3389"/>
+            <w:tcMar>
+              <w:top w:w="80" w:type="dxa"/>
+              <w:start w:w="120" w:type="dxa"/>
+              <w:bottom w:w="80" w:type="dxa"/>
+              <w:end w:w="120" w:type="dxa"/>
+            </w:tcMar>
+          </w:tcPr>
+          <w:p>
+            <w:r>
+              <w:t>Risk reasoning and recommendation wording</w:t>
+            </w:r>
+          </w:p>
+        </w:tc>
+      </w:tr>
+      <w:tr>
+        <w:tc>
+          <w:tcPr>
+            <w:tcW w:type="dxa" w:w="3389"/>
+            <w:tcMar>
+              <w:top w:w="80" w:type="dxa"/>
+              <w:start w:w="120" w:type="dxa"/>
+              <w:bottom w:w="80" w:type="dxa"/>
+              <w:end w:w="120" w:type="dxa"/>
+            </w:tcMar>
+          </w:tcPr>
+          <w:p>
+            <w:r>
+              <w:t>Planner</w:t>
+            </w:r>
+          </w:p>
+        </w:tc>
+        <w:tc>
+          <w:tcPr>
+            <w:tcW w:type="dxa" w:w="3389"/>
+            <w:tcMar>
+              <w:top w:w="80" w:type="dxa"/>
+              <w:start w:w="120" w:type="dxa"/>
+              <w:bottom w:w="80" w:type="dxa"/>
+              <w:end w:w="120" w:type="dxa"/>
+            </w:tcMar>
+          </w:tcPr>
+          <w:p>
+            <w:r>
+              <w:t>phi3:mini</w:t>
+            </w:r>
+          </w:p>
+        </w:tc>
+        <w:tc>
+          <w:tcPr>
+            <w:tcW w:type="dxa" w:w="3389"/>
+            <w:tcMar>
+              <w:top w:w="80" w:type="dxa"/>
+              <w:start w:w="120" w:type="dxa"/>
+              <w:bottom w:w="80" w:type="dxa"/>
+              <w:end w:w="120" w:type="dxa"/>
+            </w:tcMar>
+          </w:tcPr>
+          <w:p>
+            <w:r>
+              <w:t>Fast task-plan generation</w:t>
+            </w:r>
+          </w:p>
+        </w:tc>
+      </w:tr>
+    </w:tbl>
+    <w:p>
+      <w:pPr>
+        <w:pStyle w:val="IntenseQuote"/>
+      </w:pPr>
+      <w:r>
+        <w:t>The .env file can override each assignment through OLLAMA_ORCHESTRATOR_MODEL, OLLAMA_INTAKE_MODEL, OLLAMA_COMPLIANCE_MODEL, OLLAMA_RISK_MODEL, and OLLAMA_PLANNER_MODEL.</w:t>
+      </w:r>
+    </w:p>
+    <w:p>
+      <w:pPr>
+        <w:pStyle w:val="Heading1"/>
+      </w:pPr>
+      <w:r>
         <w:t>2. Multi-Agent Architecture and Orchestration</w:t>
       </w:r>
     </w:p>
@@ -627,7 +941,7 @@
     </w:p>
     <w:p>
       <w:r>
-        <w:t>LangChain is used for prompt construction, output parsing, and local Ollama chat-model execution. Each agent uses a small structured-output wrapper built around a local ChatOllama model. The agents are configured with strict prompts that emphasize evidence-only reasoning, explicit ambiguity handling, and concise JSON outputs suitable for downstream state handoffs.</w:t>
+        <w:t>LangChain is used for prompt construction, output parsing, and local Ollama chat-model execution. Each agent uses a small structured-output wrapper built around ChatOllama, but the model is selected per agent instead of using one shared model. The default configuration assigns gemma2:2b to orchestration, qwen2.5:7b to intake extraction, llama3.1:8b to compliance reasoning, mistral:7b to risk analysis, and phi3:mini to planning. The prompts still emphasize evidence-only reasoning, ambiguity handling, and JSON outputs suitable for downstream state handoffs.</w:t>
       </w:r>
     </w:p>
     <w:p>
@@ -689,12 +1003,12 @@
     </w:p>
     <w:p>
       <w:r>
-        <w:t>The deployment model is intentionally simple so the markers can run it on a student machine without paid infrastructure. Ollama hosts the local model, FastAPI exposes the backend workflow, and Streamlit provides a demonstration UI. Runtime artifacts, LangGraph checkpoints, and output bundles are written to local folders. Because the assignment prohibits paid provider keys, all core reasoning is performed locally with an Ollama model and local tools.</w:t>
+        <w:t>The deployment model is intentionally simple so the markers can run it on a student machine without paid infrastructure. Ollama hosts the local models, FastAPI exposes the backend workflow, and Streamlit provides a demonstration UI. Runtime artifacts, LangGraph checkpoints, and output bundles are written to local folders. Because the assignment prohibits paid provider keys, all core reasoning is performed locally with Ollama models and local tools.</w:t>
       </w:r>
     </w:p>
     <w:p>
       <w:r>
-        <w:t>The recommended default model is qwen3:8b because it offers strong agent-oriented behavior and tool-use capability for a small local footprint. However, the `.env` file allows the team to switch to llama3.1:8b or another Ollama-compatible model if lab hardware constraints require it. LangSmith tracing is optional at runtime; when not configured, the local JSONL audit trail still records each agent handoff and tool output.</w:t>
+        <w:t>The model map is intentionally mixed: gemma2:2b keeps the Orchestrator fast, qwen2.5:7b handles tender extraction, llama3.1:8b supports compliance analysis, mistral:7b supports risk synthesis, and phi3:mini keeps planning concise. The .env file allows the team to replace any of these with another Ollama-compatible model if lab hardware constraints require it. LangSmith tracing is optional at runtime; when not configured, the local JSONL audit trail still records each agent handoff, model assignment, and tool output.</w:t>
       </w:r>
     </w:p>
     <w:p>
@@ -744,15 +1058,15 @@
         <w:tblLook w:firstColumn="1" w:firstRow="1" w:lastColumn="0" w:lastRow="0" w:noHBand="0" w:noVBand="1" w:val="04A0"/>
       </w:tblPr>
       <w:tblGrid>
-        <w:gridCol w:w="2484"/>
-        <w:gridCol w:w="2484"/>
-        <w:gridCol w:w="2484"/>
-        <w:gridCol w:w="2484"/>
+        <w:gridCol w:w="2541"/>
+        <w:gridCol w:w="2541"/>
+        <w:gridCol w:w="2541"/>
+        <w:gridCol w:w="2541"/>
       </w:tblGrid>
       <w:tr>
         <w:tc>
           <w:tcPr>
-            <w:tcW w:type="dxa" w:w="2484"/>
+            <w:tcW w:type="dxa" w:w="2541"/>
             <w:shd w:fill="E5EEF7"/>
           </w:tcPr>
           <w:p>
@@ -763,7 +1077,7 @@
         </w:tc>
         <w:tc>
           <w:tcPr>
-            <w:tcW w:type="dxa" w:w="2484"/>
+            <w:tcW w:type="dxa" w:w="2541"/>
             <w:shd w:fill="E5EEF7"/>
           </w:tcPr>
           <w:p>
@@ -774,7 +1088,7 @@
         </w:tc>
         <w:tc>
           <w:tcPr>
-            <w:tcW w:type="dxa" w:w="2484"/>
+            <w:tcW w:type="dxa" w:w="2541"/>
             <w:shd w:fill="E5EEF7"/>
           </w:tcPr>
           <w:p>
@@ -785,7 +1099,7 @@
         </w:tc>
         <w:tc>
           <w:tcPr>
-            <w:tcW w:type="dxa" w:w="2484"/>
+            <w:tcW w:type="dxa" w:w="2541"/>
             <w:shd w:fill="E5EEF7"/>
           </w:tcPr>
           <w:p>
@@ -798,7 +1112,7 @@
       <w:tr>
         <w:tc>
           <w:tcPr>
-            <w:tcW w:type="dxa" w:w="2484"/>
+            <w:tcW w:type="dxa" w:w="2541"/>
             <w:tcMar>
               <w:top w:w="80" w:type="dxa"/>
               <w:start w:w="120" w:type="dxa"/>
@@ -814,7 +1128,7 @@
         </w:tc>
         <w:tc>
           <w:tcPr>
-            <w:tcW w:type="dxa" w:w="2484"/>
+            <w:tcW w:type="dxa" w:w="2541"/>
             <w:tcMar>
               <w:top w:w="80" w:type="dxa"/>
               <w:start w:w="120" w:type="dxa"/>
@@ -830,7 +1144,7 @@
         </w:tc>
         <w:tc>
           <w:tcPr>
-            <w:tcW w:type="dxa" w:w="2484"/>
+            <w:tcW w:type="dxa" w:w="2541"/>
             <w:tcMar>
               <w:top w:w="80" w:type="dxa"/>
               <w:start w:w="120" w:type="dxa"/>
@@ -846,7 +1160,7 @@
         </w:tc>
         <w:tc>
           <w:tcPr>
-            <w:tcW w:type="dxa" w:w="2484"/>
+            <w:tcW w:type="dxa" w:w="2541"/>
             <w:tcMar>
               <w:top w:w="80" w:type="dxa"/>
               <w:start w:w="120" w:type="dxa"/>
@@ -864,7 +1178,7 @@
       <w:tr>
         <w:tc>
           <w:tcPr>
-            <w:tcW w:type="dxa" w:w="2484"/>
+            <w:tcW w:type="dxa" w:w="2541"/>
             <w:tcMar>
               <w:top w:w="80" w:type="dxa"/>
               <w:start w:w="120" w:type="dxa"/>
@@ -880,7 +1194,7 @@
         </w:tc>
         <w:tc>
           <w:tcPr>
-            <w:tcW w:type="dxa" w:w="2484"/>
+            <w:tcW w:type="dxa" w:w="2541"/>
             <w:tcMar>
               <w:top w:w="80" w:type="dxa"/>
               <w:start w:w="120" w:type="dxa"/>
@@ -896,7 +1210,7 @@
         </w:tc>
         <w:tc>
           <w:tcPr>
-            <w:tcW w:type="dxa" w:w="2484"/>
+            <w:tcW w:type="dxa" w:w="2541"/>
             <w:tcMar>
               <w:top w:w="80" w:type="dxa"/>
               <w:start w:w="120" w:type="dxa"/>
@@ -912,7 +1226,7 @@
         </w:tc>
         <w:tc>
           <w:tcPr>
-            <w:tcW w:type="dxa" w:w="2484"/>
+            <w:tcW w:type="dxa" w:w="2541"/>
             <w:tcMar>
               <w:top w:w="80" w:type="dxa"/>
               <w:start w:w="120" w:type="dxa"/>
@@ -930,7 +1244,7 @@
       <w:tr>
         <w:tc>
           <w:tcPr>
-            <w:tcW w:type="dxa" w:w="2484"/>
+            <w:tcW w:type="dxa" w:w="2541"/>
             <w:tcMar>
               <w:top w:w="80" w:type="dxa"/>
               <w:start w:w="120" w:type="dxa"/>
@@ -946,7 +1260,7 @@
         </w:tc>
         <w:tc>
           <w:tcPr>
-            <w:tcW w:type="dxa" w:w="2484"/>
+            <w:tcW w:type="dxa" w:w="2541"/>
             <w:tcMar>
               <w:top w:w="80" w:type="dxa"/>
               <w:start w:w="120" w:type="dxa"/>
@@ -962,7 +1276,7 @@
         </w:tc>
         <w:tc>
           <w:tcPr>
-            <w:tcW w:type="dxa" w:w="2484"/>
+            <w:tcW w:type="dxa" w:w="2541"/>
             <w:tcMar>
               <w:top w:w="80" w:type="dxa"/>
               <w:start w:w="120" w:type="dxa"/>
@@ -978,7 +1292,7 @@
         </w:tc>
         <w:tc>
           <w:tcPr>
-            <w:tcW w:type="dxa" w:w="2484"/>
+            <w:tcW w:type="dxa" w:w="2541"/>
             <w:tcMar>
               <w:top w:w="80" w:type="dxa"/>
               <w:start w:w="120" w:type="dxa"/>
@@ -996,7 +1310,7 @@
       <w:tr>
         <w:tc>
           <w:tcPr>
-            <w:tcW w:type="dxa" w:w="2484"/>
+            <w:tcW w:type="dxa" w:w="2541"/>
             <w:tcMar>
               <w:top w:w="80" w:type="dxa"/>
               <w:start w:w="120" w:type="dxa"/>
@@ -1012,7 +1326,7 @@
         </w:tc>
         <w:tc>
           <w:tcPr>
-            <w:tcW w:type="dxa" w:w="2484"/>
+            <w:tcW w:type="dxa" w:w="2541"/>
             <w:tcMar>
               <w:top w:w="80" w:type="dxa"/>
               <w:start w:w="120" w:type="dxa"/>
@@ -1028,7 +1342,7 @@
         </w:tc>
         <w:tc>
           <w:tcPr>
-            <w:tcW w:type="dxa" w:w="2484"/>
+            <w:tcW w:type="dxa" w:w="2541"/>
             <w:tcMar>
               <w:top w:w="80" w:type="dxa"/>
               <w:start w:w="120" w:type="dxa"/>
@@ -1044,7 +1358,7 @@
         </w:tc>
         <w:tc>
           <w:tcPr>
-            <w:tcW w:type="dxa" w:w="2484"/>
+            <w:tcW w:type="dxa" w:w="2541"/>
             <w:tcMar>
               <w:top w:w="80" w:type="dxa"/>
               <w:start w:w="120" w:type="dxa"/>
@@ -1070,7 +1384,7 @@
     </w:p>
     <w:sectPr>
       <w:pgSz w:w="12240" w:h="15840"/>
-      <w:pgMar w:top="1008" w:right="1152" w:bottom="1008" w:left="1152" w:header="720" w:footer="720" w:gutter="0"/>
+      <w:pgMar w:top="792" w:right="1037" w:bottom="792" w:left="1037" w:header="720" w:footer="720" w:gutter="0"/>
       <w:cols w:space="720"/>
       <w:docGrid w:linePitch="360"/>
     </w:sectPr>
@@ -1443,7 +1757,7 @@
     <w:rsid w:val="00FC693F"/>
     <w:rPr>
       <w:rFonts w:ascii="Aptos" w:hAnsi="Aptos"/>
-      <w:sz w:val="21"/>
+      <w:sz w:val="20"/>
     </w:rPr>
   </w:style>
   <w:style w:type="paragraph" w:styleId="Header">
@@ -1509,7 +1823,7 @@
       <w:b/>
       <w:bCs/>
       <w:color w:val="113456"/>
-      <w:sz w:val="30"/>
+      <w:sz w:val="28"/>
       <w:szCs w:val="28"/>
     </w:rPr>
   </w:style>

</xml_diff>